<commit_message>
Update pipeline docs for local deployment
</commit_message>
<xml_diff>
--- a/docs/pipeline.docx
+++ b/docs/pipeline.docx
@@ -1993,9 +1993,9 @@
       <w:pPr>
         <w:pStyle w:val="Heading2"/>
       </w:pPr>
-      <w:bookmarkStart w:id="21" w:name="_2389a877b9314e9520e5ed4e5ba6dc624fa7dda"/>
-      <w:r>
-        <w:t xml:space="preserve">Stage 10 — Deploy to Render</w:t>
+      <w:bookmarkStart w:id="21" w:name="_e812a697f74f08bcb30b6c0cd62da9916e68701"/>
+      <w:r>
+        <w:t xml:space="preserve">Stage 10 — Deploy Locally</w:t>
       </w:r>
       <w:bookmarkEnd w:id="21"/>
     </w:p>
@@ -2019,7 +2019,7 @@
         <w:rPr>
           <w:rStyle w:val="StringTok"/>
         </w:rPr>
-        <w:t xml:space="preserve">'Deploy to Render'</w:t>
+        <w:t xml:space="preserve">'Deploy locally'</w:t>
       </w:r>
       <w:r>
         <w:rPr>
@@ -2061,112 +2061,7 @@
         <w:rPr>
           <w:rStyle w:val="NormalTok"/>
         </w:rPr>
-        <w:t xml:space="preserve">        </w:t>
-      </w:r>
-      <w:r>
-        <w:rPr>
-          <w:rStyle w:val="FunctionTok"/>
-        </w:rPr>
-        <w:t xml:space="preserve">withCredentials</w:t>
-      </w:r>
-      <w:r>
-        <w:rPr>
-          <w:rStyle w:val="OperatorTok"/>
-        </w:rPr>
-        <w:t xml:space="preserve">([</w:t>
-      </w:r>
-      <w:r>
-        <w:rPr>
-          <w:rStyle w:val="FunctionTok"/>
-        </w:rPr>
-        <w:t xml:space="preserve">string</w:t>
-      </w:r>
-      <w:r>
-        <w:rPr>
-          <w:rStyle w:val="OperatorTok"/>
-        </w:rPr>
-        <w:t xml:space="preserve">(</w:t>
-      </w:r>
-      <w:r>
-        <w:rPr>
-          <w:rStyle w:val="NormalTok"/>
-        </w:rPr>
-        <w:t xml:space="preserve">credentialsId</w:t>
-      </w:r>
-      <w:r>
-        <w:rPr>
-          <w:rStyle w:val="OperatorTok"/>
-        </w:rPr>
-        <w:t xml:space="preserve">:</w:t>
-      </w:r>
-      <w:r>
-        <w:rPr>
-          <w:rStyle w:val="NormalTok"/>
-        </w:rPr>
-        <w:t xml:space="preserve"> </w:t>
-      </w:r>
-      <w:r>
-        <w:rPr>
-          <w:rStyle w:val="StringTok"/>
-        </w:rPr>
-        <w:t xml:space="preserve">'render-deploy-hook'</w:t>
-      </w:r>
-      <w:r>
-        <w:rPr>
-          <w:rStyle w:val="OperatorTok"/>
-        </w:rPr>
-        <w:t xml:space="preserve">,</w:t>
-      </w:r>
-      <w:r>
-        <w:rPr>
-          <w:rStyle w:val="NormalTok"/>
-        </w:rPr>
-        <w:t xml:space="preserve"> variable</w:t>
-      </w:r>
-      <w:r>
-        <w:rPr>
-          <w:rStyle w:val="OperatorTok"/>
-        </w:rPr>
-        <w:t xml:space="preserve">:</w:t>
-      </w:r>
-      <w:r>
-        <w:rPr>
-          <w:rStyle w:val="NormalTok"/>
-        </w:rPr>
-        <w:t xml:space="preserve"> </w:t>
-      </w:r>
-      <w:r>
-        <w:rPr>
-          <w:rStyle w:val="StringTok"/>
-        </w:rPr>
-        <w:t xml:space="preserve">'RENDER_DEPLOY_HOOK'</w:t>
-      </w:r>
-      <w:r>
-        <w:rPr>
-          <w:rStyle w:val="OperatorTok"/>
-        </w:rPr>
-        <w:t xml:space="preserve">)])</w:t>
-      </w:r>
-      <w:r>
-        <w:rPr>
-          <w:rStyle w:val="NormalTok"/>
-        </w:rPr>
-        <w:t xml:space="preserve"> </w:t>
-      </w:r>
-      <w:r>
-        <w:rPr>
-          <w:rStyle w:val="OperatorTok"/>
-        </w:rPr>
-        <w:t xml:space="preserve">{</w:t>
-      </w:r>
-      <w:r>
-        <w:br/>
-      </w:r>
-      <w:r>
-        <w:rPr>
-          <w:rStyle w:val="NormalTok"/>
-        </w:rPr>
-        <w:t xml:space="preserve">            sh </w:t>
+        <w:t xml:space="preserve">        sh </w:t>
       </w:r>
       <w:r>
         <w:rPr>
@@ -2181,61 +2076,61 @@
         <w:rPr>
           <w:rStyle w:val="StringTok"/>
         </w:rPr>
-        <w:t xml:space="preserve">                set -e</w:t>
-      </w:r>
-      <w:r>
-        <w:br/>
-      </w:r>
-      <w:r>
-        <w:rPr>
-          <w:rStyle w:val="StringTok"/>
-        </w:rPr>
-        <w:t xml:space="preserve">                echo "Triggering Render deployment..."</w:t>
-      </w:r>
-      <w:r>
-        <w:br/>
-      </w:r>
-      <w:r>
-        <w:rPr>
-          <w:rStyle w:val="StringTok"/>
-        </w:rPr>
-        <w:t xml:space="preserve">                curl -fsS -X POST "$RENDER_DEPLOY_HOOK"</w:t>
-      </w:r>
-      <w:r>
-        <w:br/>
-      </w:r>
-      <w:r>
-        <w:rPr>
-          <w:rStyle w:val="StringTok"/>
-        </w:rPr>
-        <w:t xml:space="preserve">                echo</w:t>
-      </w:r>
-      <w:r>
-        <w:br/>
-      </w:r>
-      <w:r>
-        <w:rPr>
-          <w:rStyle w:val="StringTok"/>
-        </w:rPr>
-        <w:t xml:space="preserve">                echo "Render deployment triggered successfully."</w:t>
-      </w:r>
-      <w:r>
-        <w:br/>
-      </w:r>
-      <w:r>
-        <w:rPr>
-          <w:rStyle w:val="StringTok"/>
-        </w:rPr>
-        <w:t xml:space="preserve">            '''</w:t>
-      </w:r>
-      <w:r>
-        <w:br/>
-      </w:r>
-      <w:r>
-        <w:rPr>
-          <w:rStyle w:val="NormalTok"/>
-        </w:rPr>
-        <w:t xml:space="preserve">        </w:t>
+        <w:t xml:space="preserve">            set -e</w:t>
+      </w:r>
+      <w:r>
+        <w:br/>
+      </w:r>
+      <w:r>
+        <w:rPr>
+          <w:rStyle w:val="StringTok"/>
+        </w:rPr>
+        <w:t xml:space="preserve">            echo "Deploying locally with Docker Compose..."</w:t>
+      </w:r>
+      <w:r>
+        <w:br/>
+      </w:r>
+      <w:r>
+        <w:rPr>
+          <w:rStyle w:val="StringTok"/>
+        </w:rPr>
+        <w:t xml:space="preserve">            docker compose down || true</w:t>
+      </w:r>
+      <w:r>
+        <w:br/>
+      </w:r>
+      <w:r>
+        <w:rPr>
+          <w:rStyle w:val="StringTok"/>
+        </w:rPr>
+        <w:t xml:space="preserve">            docker compose up -d --build</w:t>
+      </w:r>
+      <w:r>
+        <w:br/>
+      </w:r>
+      <w:r>
+        <w:rPr>
+          <w:rStyle w:val="StringTok"/>
+        </w:rPr>
+        <w:t xml:space="preserve">            echo "Local deployment complete."</w:t>
+      </w:r>
+      <w:r>
+        <w:br/>
+      </w:r>
+      <w:r>
+        <w:rPr>
+          <w:rStyle w:val="StringTok"/>
+        </w:rPr>
+        <w:t xml:space="preserve">        '''</w:t>
+      </w:r>
+      <w:r>
+        <w:br/>
+      </w:r>
+      <w:r>
+        <w:rPr>
+          <w:rStyle w:val="NormalTok"/>
+        </w:rPr>
+        <w:t xml:space="preserve">    </w:t>
       </w:r>
       <w:r>
         <w:rPr>
@@ -2248,32 +2143,17 @@
       </w:r>
       <w:r>
         <w:rPr>
-          <w:rStyle w:val="NormalTok"/>
-        </w:rPr>
-        <w:t xml:space="preserve">    </w:t>
-      </w:r>
-      <w:r>
-        <w:rPr>
           <w:rStyle w:val="OperatorTok"/>
         </w:rPr>
         <w:t xml:space="preserve">}</w:t>
       </w:r>
-      <w:r>
-        <w:br/>
-      </w:r>
-      <w:r>
-        <w:rPr>
-          <w:rStyle w:val="OperatorTok"/>
-        </w:rPr>
-        <w:t xml:space="preserve">}</w:t>
-      </w:r>
     </w:p>
     <w:p>
       <w:pPr>
         <w:pStyle w:val="FirstParagraph"/>
       </w:pPr>
       <w:r>
-        <w:t xml:space="preserve">Triggers Render deployment using a secured Jenkins secret.</w:t>
+        <w:t xml:space="preserve">Deploys the application locally using Docker Compose.</w:t>
       </w:r>
     </w:p>
     <w:p>
@@ -2648,33 +2528,6 @@
             </w:pPr>
             <w:r>
               <w:t xml:space="preserve">SonarQube authentication token</w:t>
-            </w:r>
-          </w:p>
-        </w:tc>
-      </w:tr>
-      <w:tr>
-        <w:tc>
-          <w:tcPr/>
-          <w:p>
-            <w:pPr>
-              <w:pStyle w:val="Compact"/>
-            </w:pPr>
-            <w:r>
-              <w:rPr>
-                <w:rStyle w:val="VerbatimChar"/>
-              </w:rPr>
-              <w:t xml:space="preserve">render-deploy-hook</w:t>
-            </w:r>
-          </w:p>
-        </w:tc>
-        <w:tc>
-          <w:tcPr/>
-          <w:p>
-            <w:pPr>
-              <w:pStyle w:val="Compact"/>
-            </w:pPr>
-            <w:r>
-              <w:t xml:space="preserve">Render deployment webhook URL</w:t>
             </w:r>
           </w:p>
         </w:tc>

</xml_diff>

<commit_message>
Update pipeline docs for frontend retry and local UI link
</commit_message>
<xml_diff>
--- a/docs/pipeline.docx
+++ b/docs/pipeline.docx
@@ -1269,7 +1269,88 @@
         <w:rPr>
           <w:rStyle w:val="StringTok"/>
         </w:rPr>
-        <w:t xml:space="preserve">            npm run build</w:t>
+        <w:t xml:space="preserve">            for attempt in 1 2 3; do</w:t>
+      </w:r>
+      <w:r>
+        <w:br/>
+      </w:r>
+      <w:r>
+        <w:rPr>
+          <w:rStyle w:val="StringTok"/>
+        </w:rPr>
+        <w:t xml:space="preserve">                if npm run build; then</w:t>
+      </w:r>
+      <w:r>
+        <w:br/>
+      </w:r>
+      <w:r>
+        <w:rPr>
+          <w:rStyle w:val="StringTok"/>
+        </w:rPr>
+        <w:t xml:space="preserve">                    break</w:t>
+      </w:r>
+      <w:r>
+        <w:br/>
+      </w:r>
+      <w:r>
+        <w:rPr>
+          <w:rStyle w:val="StringTok"/>
+        </w:rPr>
+        <w:t xml:space="preserve">                fi</w:t>
+      </w:r>
+      <w:r>
+        <w:br/>
+      </w:r>
+      <w:r>
+        <w:rPr>
+          <w:rStyle w:val="StringTok"/>
+        </w:rPr>
+        <w:t xml:space="preserve">                echo "Frontend build failed on attempt $attempt; retrying..."</w:t>
+      </w:r>
+      <w:r>
+        <w:br/>
+      </w:r>
+      <w:r>
+        <w:rPr>
+          <w:rStyle w:val="StringTok"/>
+        </w:rPr>
+        <w:t xml:space="preserve">                sleep 5</w:t>
+      </w:r>
+      <w:r>
+        <w:br/>
+      </w:r>
+      <w:r>
+        <w:rPr>
+          <w:rStyle w:val="StringTok"/>
+        </w:rPr>
+        <w:t xml:space="preserve">                if [ "$attempt" = "3" ]; then</w:t>
+      </w:r>
+      <w:r>
+        <w:br/>
+      </w:r>
+      <w:r>
+        <w:rPr>
+          <w:rStyle w:val="StringTok"/>
+        </w:rPr>
+        <w:t xml:space="preserve">                    exit 1</w:t>
+      </w:r>
+      <w:r>
+        <w:br/>
+      </w:r>
+      <w:r>
+        <w:rPr>
+          <w:rStyle w:val="StringTok"/>
+        </w:rPr>
+        <w:t xml:space="preserve">                fi</w:t>
+      </w:r>
+      <w:r>
+        <w:br/>
+      </w:r>
+      <w:r>
+        <w:rPr>
+          <w:rStyle w:val="StringTok"/>
+        </w:rPr>
+        <w:t xml:space="preserve">            done</w:t>
       </w:r>
       <w:r>
         <w:br/>
@@ -1310,7 +1391,7 @@
         <w:pStyle w:val="FirstParagraph"/>
       </w:pPr>
       <w:r>
-        <w:t xml:space="preserve">Installs Node dependencies and builds Tailwind/Vite assets.</w:t>
+        <w:t xml:space="preserve">Installs Node dependencies and builds Tailwind/Vite assets. The build is retried up to three times to handle transient network failures while fetching fonts.</w:t>
       </w:r>
     </w:p>
     <w:p>
@@ -2121,6 +2202,15 @@
         <w:rPr>
           <w:rStyle w:val="StringTok"/>
         </w:rPr>
+        <w:t xml:space="preserve">            echo "UI available at: http://localhost:8000"</w:t>
+      </w:r>
+      <w:r>
+        <w:br/>
+      </w:r>
+      <w:r>
+        <w:rPr>
+          <w:rStyle w:val="StringTok"/>
+        </w:rPr>
         <w:t xml:space="preserve">        '''</w:t>
       </w:r>
       <w:r>
@@ -2153,7 +2243,7 @@
         <w:pStyle w:val="FirstParagraph"/>
       </w:pPr>
       <w:r>
-        <w:t xml:space="preserve">Deploys the application locally using Docker Compose.</w:t>
+        <w:t xml:space="preserve">Deploys the application locally using Docker Compose and prints the local UI link.</w:t>
       </w:r>
     </w:p>
     <w:p>
@@ -2218,6 +2308,21 @@
           <w:rStyle w:val="StringTok"/>
         </w:rPr>
         <w:t xml:space="preserve">'CI/CD pipeline completed successfully.'</w:t>
+      </w:r>
+      <w:r>
+        <w:br/>
+      </w:r>
+      <w:r>
+        <w:rPr>
+          <w:rStyle w:val="NormalTok"/>
+        </w:rPr>
+        <w:t xml:space="preserve">        echo </w:t>
+      </w:r>
+      <w:r>
+        <w:rPr>
+          <w:rStyle w:val="StringTok"/>
+        </w:rPr>
+        <w:t xml:space="preserve">'UI available at: http://localhost:8000'</w:t>
       </w:r>
       <w:r>
         <w:br/>

</xml_diff>

<commit_message>
Translate pipeline documentation to French
</commit_message>
<xml_diff>
--- a/docs/pipeline.docx
+++ b/docs/pipeline.docx
@@ -6,9 +6,9 @@
       <w:pPr>
         <w:pStyle w:val="Heading1"/>
       </w:pPr>
-      <w:bookmarkStart w:id="9" w:name="_fb4c280fedb9ed133f7e8b08d507cd575c0fa0a"/>
-      <w:r>
-        <w:t xml:space="preserve">NutriTrace Jenkins Pipeline — Step-by-Step Documentation</w:t>
+      <w:bookmarkStart w:id="9" w:name="_cf1ab96d82f8843a2658fd77a14bede9ba12c2f"/>
+      <w:r>
+        <w:t xml:space="preserve">Pipeline Jenkins NutriTrace — Documentation étape par étape</w:t>
       </w:r>
       <w:bookmarkEnd w:id="9"/>
     </w:p>
@@ -17,7 +17,7 @@
         <w:pStyle w:val="FirstParagraph"/>
       </w:pPr>
       <w:r>
-        <w:t xml:space="preserve">This document explains the NutriTrace Jenkins pipeline defined in</w:t>
+        <w:t xml:space="preserve">Ce document explique le pipeline Jenkins de NutriTrace défini dans</w:t>
       </w:r>
       <w:r>
         <w:t xml:space="preserve"> </w:t>
@@ -35,16 +35,16 @@
         <w:t xml:space="preserve"> </w:t>
       </w:r>
       <w:r>
-        <w:t xml:space="preserve">Each section shows the exact pipeline step and a short explanation.</w:t>
+        <w:t xml:space="preserve">Chaque section présente l’étape exacte du pipeline et une courte explication.</w:t>
       </w:r>
     </w:p>
     <w:p>
       <w:pPr>
         <w:pStyle w:val="Heading2"/>
       </w:pPr>
-      <w:bookmarkStart w:id="10" w:name="_975c14b8838bc669bbc41bf82754097efd218d8"/>
-      <w:r>
-        <w:t xml:space="preserve">Pipeline Options</w:t>
+      <w:bookmarkStart w:id="10" w:name="_97256f70146aabb1f65f9f1819e25347b5abb29"/>
+      <w:r>
+        <w:t xml:space="preserve">Options du pipeline</w:t>
       </w:r>
       <w:bookmarkEnd w:id="10"/>
     </w:p>
@@ -194,7 +194,10 @@
         <w:t xml:space="preserve">timestamps()</w:t>
       </w:r>
       <w:r>
-        <w:t xml:space="preserve">: adds timestamps to console output.</w:t>
+        <w:t xml:space="preserve"> </w:t>
+      </w:r>
+      <w:r>
+        <w:t xml:space="preserve">: ajoute des horodatages dans la sortie console.</w:t>
       </w:r>
     </w:p>
     <w:p>
@@ -212,7 +215,10 @@
         <w:t xml:space="preserve">disableConcurrentBuilds()</w:t>
       </w:r>
       <w:r>
-        <w:t xml:space="preserve">: prevents overlapping builds.</w:t>
+        <w:t xml:space="preserve"> </w:t>
+      </w:r>
+      <w:r>
+        <w:t xml:space="preserve">: empêche les builds simultanés.</w:t>
       </w:r>
     </w:p>
     <w:p>
@@ -230,16 +236,19 @@
         <w:t xml:space="preserve">buildDiscarder(...)</w:t>
       </w:r>
       <w:r>
-        <w:t xml:space="preserve">: keeps only the last 20 builds.</w:t>
+        <w:t xml:space="preserve"> </w:t>
+      </w:r>
+      <w:r>
+        <w:t xml:space="preserve">: conserve uniquement les 20 derniers builds.</w:t>
       </w:r>
     </w:p>
     <w:p>
       <w:pPr>
         <w:pStyle w:val="Heading2"/>
       </w:pPr>
-      <w:bookmarkStart w:id="11" w:name="_23a42e3d4530bcfad30ae7092bb1e1089620f0f"/>
-      <w:r>
-        <w:t xml:space="preserve">Environment Variables</w:t>
+      <w:bookmarkStart w:id="11" w:name="_47c9201f1030a65e6e2083c0d456ad32e4dfe1d"/>
+      <w:r>
+        <w:t xml:space="preserve">Variables d’environnement</w:t>
       </w:r>
       <w:bookmarkEnd w:id="11"/>
     </w:p>
@@ -425,7 +434,10 @@
         <w:t xml:space="preserve">SONAR_HOST_URL</w:t>
       </w:r>
       <w:r>
-        <w:t xml:space="preserve">: SonarQube server URL.</w:t>
+        <w:t xml:space="preserve"> </w:t>
+      </w:r>
+      <w:r>
+        <w:t xml:space="preserve">: URL du serveur SonarQube.</w:t>
       </w:r>
     </w:p>
     <w:p>
@@ -458,7 +470,10 @@
         <w:t xml:space="preserve">PATH</w:t>
       </w:r>
       <w:r>
-        <w:t xml:space="preserve">: Java 21 used by SonarScanner.</w:t>
+        <w:t xml:space="preserve"> </w:t>
+      </w:r>
+      <w:r>
+        <w:t xml:space="preserve">: Java 21 utilisé par SonarScanner.</w:t>
       </w:r>
     </w:p>
     <w:p>
@@ -472,9 +487,9 @@
       <w:pPr>
         <w:pStyle w:val="Heading2"/>
       </w:pPr>
-      <w:bookmarkStart w:id="12" w:name="_43fa9971be95a3617ff8ccca8fbcdb13c43d0f3"/>
-      <w:r>
-        <w:t xml:space="preserve">Stage 1 — Checkout</w:t>
+      <w:bookmarkStart w:id="12" w:name="_2b7d3b277898fd9e290a132de4cece7f5c65d4c"/>
+      <w:r>
+        <w:t xml:space="preserve">Étape 1 — Checkout</w:t>
       </w:r>
       <w:bookmarkEnd w:id="12"/>
     </w:p>
@@ -572,7 +587,7 @@
         <w:pStyle w:val="FirstParagraph"/>
       </w:pPr>
       <w:r>
-        <w:t xml:space="preserve">Clones the repository from GitHub and loads the</w:t>
+        <w:t xml:space="preserve">Clone le dépôt depuis GitHub et charge le</w:t>
       </w:r>
       <w:r>
         <w:t xml:space="preserve"> </w:t>
@@ -598,9 +613,9 @@
       <w:pPr>
         <w:pStyle w:val="Heading2"/>
       </w:pPr>
-      <w:bookmarkStart w:id="13" w:name="_9de385c05091612b14976bfb907620efa9dd1d7"/>
-      <w:r>
-        <w:t xml:space="preserve">Stage 2 — Install PHP Dependencies</w:t>
+      <w:bookmarkStart w:id="13" w:name="_5d8d23522d23b6f662e41323650dd7b79c3187b"/>
+      <w:r>
+        <w:t xml:space="preserve">Étape 2 — Installation des dépendances PHP</w:t>
       </w:r>
       <w:bookmarkEnd w:id="13"/>
     </w:p>
@@ -704,7 +719,7 @@
         <w:pStyle w:val="FirstParagraph"/>
       </w:pPr>
       <w:r>
-        <w:t xml:space="preserve">Installs PHP dependencies without running interactive prompts.</w:t>
+        <w:t xml:space="preserve">Installe les dépendances PHP sans interaction.</w:t>
       </w:r>
     </w:p>
     <w:p>
@@ -718,9 +733,9 @@
       <w:pPr>
         <w:pStyle w:val="Heading2"/>
       </w:pPr>
-      <w:bookmarkStart w:id="14" w:name="_26acd2f92b23cde389d13ca3fca4efb43aec295"/>
-      <w:r>
-        <w:t xml:space="preserve">Stage 3 — Prepare Environment</w:t>
+      <w:bookmarkStart w:id="14" w:name="_ba2e87d7038fdde4a98988f972c36410659c5f3"/>
+      <w:r>
+        <w:t xml:space="preserve">Étape 3 — Préparation de l’environnement</w:t>
       </w:r>
       <w:bookmarkEnd w:id="14"/>
     </w:p>
@@ -887,7 +902,7 @@
         <w:pStyle w:val="FirstParagraph"/>
       </w:pPr>
       <w:r>
-        <w:t xml:space="preserve">Creates a local</w:t>
+        <w:t xml:space="preserve">Crée un fichier</w:t>
       </w:r>
       <w:r>
         <w:t xml:space="preserve"> </w:t>
@@ -899,7 +914,10 @@
         <w:t xml:space="preserve">.env</w:t>
       </w:r>
       <w:r>
-        <w:t xml:space="preserve">, generates the application key, and configures SQLite for testing.</w:t>
+        <w:t xml:space="preserve"> </w:t>
+      </w:r>
+      <w:r>
+        <w:t xml:space="preserve">local, génère la clé d’application et configure SQLite pour les tests.</w:t>
       </w:r>
     </w:p>
     <w:p>
@@ -913,9 +931,9 @@
       <w:pPr>
         <w:pStyle w:val="Heading2"/>
       </w:pPr>
-      <w:bookmarkStart w:id="15" w:name="_08d3ccba12b248dd7bc3cab5056facb80f167e5"/>
-      <w:r>
-        <w:t xml:space="preserve">Stage 4 — Lint (Pint)</w:t>
+      <w:bookmarkStart w:id="15" w:name="_d65427d7edaee028971c0cb53389c7b51311367"/>
+      <w:r>
+        <w:t xml:space="preserve">Étape 4 — Lint (Pint)</w:t>
       </w:r>
       <w:bookmarkEnd w:id="15"/>
     </w:p>
@@ -1019,7 +1037,7 @@
         <w:pStyle w:val="FirstParagraph"/>
       </w:pPr>
       <w:r>
-        <w:t xml:space="preserve">Checks PHP code style using Laravel Pint.</w:t>
+        <w:t xml:space="preserve">Vérifie le style du code PHP avec Laravel Pint.</w:t>
       </w:r>
     </w:p>
     <w:p>
@@ -1033,9 +1051,9 @@
       <w:pPr>
         <w:pStyle w:val="Heading2"/>
       </w:pPr>
-      <w:bookmarkStart w:id="16" w:name="_ff47f6acdd26cd974af4f8ddcf4a5988f291e5e"/>
-      <w:r>
-        <w:t xml:space="preserve">Stage 5 — Syntax Check</w:t>
+      <w:bookmarkStart w:id="16" w:name="_d315c319d933bf2d95b1fdec475269ca5d92b45"/>
+      <w:r>
+        <w:t xml:space="preserve">Étape 5 — Vérification syntaxique</w:t>
       </w:r>
       <w:bookmarkEnd w:id="16"/>
     </w:p>
@@ -1139,7 +1157,7 @@
         <w:pStyle w:val="FirstParagraph"/>
       </w:pPr>
       <w:r>
-        <w:t xml:space="preserve">Runs</w:t>
+        <w:t xml:space="preserve">Exécute</w:t>
       </w:r>
       <w:r>
         <w:t xml:space="preserve"> </w:t>
@@ -1154,7 +1172,7 @@
         <w:t xml:space="preserve"> </w:t>
       </w:r>
       <w:r>
-        <w:t xml:space="preserve">on all PHP files in parallel.</w:t>
+        <w:t xml:space="preserve">sur tous les fichiers PHP en parallèle.</w:t>
       </w:r>
     </w:p>
     <w:p>
@@ -1168,9 +1186,9 @@
       <w:pPr>
         <w:pStyle w:val="Heading2"/>
       </w:pPr>
-      <w:bookmarkStart w:id="17" w:name="_679aa014440a5d5aa84a777c8da906f91a4e01e"/>
-      <w:r>
-        <w:t xml:space="preserve">Stage 6 — Build Frontend</w:t>
+      <w:bookmarkStart w:id="17" w:name="_0efae85683ffb25de23c65491421ad524aaf153"/>
+      <w:r>
+        <w:t xml:space="preserve">Étape 6 — Build du frontend</w:t>
       </w:r>
       <w:bookmarkEnd w:id="17"/>
     </w:p>
@@ -1391,7 +1409,7 @@
         <w:pStyle w:val="FirstParagraph"/>
       </w:pPr>
       <w:r>
-        <w:t xml:space="preserve">Installs Node dependencies and builds Tailwind/Vite assets. The build is retried up to three times to handle transient network failures while fetching fonts.</w:t>
+        <w:t xml:space="preserve">Installe les dépendances Node et compile les assets Tailwind/Vite. Le build est réessayé jusqu’à trois fois pour gérer les échecs réseau transitoires lors du téléchargement des polices.</w:t>
       </w:r>
     </w:p>
     <w:p>
@@ -1405,9 +1423,9 @@
       <w:pPr>
         <w:pStyle w:val="Heading2"/>
       </w:pPr>
-      <w:bookmarkStart w:id="18" w:name="_16a3cbfdf6d5e7c5ee130db53e399325a943e8a"/>
-      <w:r>
-        <w:t xml:space="preserve">Stage 7 — Migrate &amp; Seed</w:t>
+      <w:bookmarkStart w:id="18" w:name="_a0a4ab28a3da1fba096ec176176e6bfd2e9d9c8"/>
+      <w:r>
+        <w:t xml:space="preserve">Étape 7 — Migration et seed</w:t>
       </w:r>
       <w:bookmarkEnd w:id="18"/>
     </w:p>
@@ -1547,7 +1565,7 @@
         <w:pStyle w:val="FirstParagraph"/>
       </w:pPr>
       <w:r>
-        <w:t xml:space="preserve">Creates the database schema and inserts demo data.</w:t>
+        <w:t xml:space="preserve">Crée le schéma de base de données et insère les données de démonstration.</w:t>
       </w:r>
     </w:p>
     <w:p>
@@ -1561,9 +1579,9 @@
       <w:pPr>
         <w:pStyle w:val="Heading2"/>
       </w:pPr>
-      <w:bookmarkStart w:id="19" w:name="_3d3c2cc30da81781fdfff83921290af84d3ca12"/>
-      <w:r>
-        <w:t xml:space="preserve">Stage 8 — Tests &amp; Coverage</w:t>
+      <w:bookmarkStart w:id="19" w:name="_45ab1b4b00e7b94264c331a693e7318fd40b04b"/>
+      <w:r>
+        <w:t xml:space="preserve">Étape 8 — Tests et couverture</w:t>
       </w:r>
       <w:bookmarkEnd w:id="19"/>
     </w:p>
@@ -1667,7 +1685,7 @@
         <w:pStyle w:val="FirstParagraph"/>
       </w:pPr>
       <w:r>
-        <w:t xml:space="preserve">Runs the full PHPUnit suite with Xdebug coverage and generates</w:t>
+        <w:t xml:space="preserve">Exécute toute la suite PHPUnit avec la couverture Xdebug et génère</w:t>
       </w:r>
       <w:r>
         <w:t xml:space="preserve"> </w:t>
@@ -1693,9 +1711,9 @@
       <w:pPr>
         <w:pStyle w:val="Heading2"/>
       </w:pPr>
-      <w:bookmarkStart w:id="20" w:name="_bda695cf27f692a1601817f7daf56c23afe573b"/>
-      <w:r>
-        <w:t xml:space="preserve">Stage 9 — SonarQube Analysis</w:t>
+      <w:bookmarkStart w:id="20" w:name="_e45338fe5dea94cb903d24298840de412fa3bc5"/>
+      <w:r>
+        <w:t xml:space="preserve">Étape 9 — Analyse SonarQube</w:t>
       </w:r>
       <w:bookmarkEnd w:id="20"/>
     </w:p>
@@ -2060,7 +2078,7 @@
         <w:pStyle w:val="FirstParagraph"/>
       </w:pPr>
       <w:r>
-        <w:t xml:space="preserve">Runs SonarScanner and waits for the quality gate. The build fails if the gate fails.</w:t>
+        <w:t xml:space="preserve">Exécute SonarScanner et attend le quality gate. Le build échoue si le quality gate échoue.</w:t>
       </w:r>
     </w:p>
     <w:p>
@@ -2074,9 +2092,9 @@
       <w:pPr>
         <w:pStyle w:val="Heading2"/>
       </w:pPr>
-      <w:bookmarkStart w:id="21" w:name="_e812a697f74f08bcb30b6c0cd62da9916e68701"/>
-      <w:r>
-        <w:t xml:space="preserve">Stage 10 — Deploy Locally</w:t>
+      <w:bookmarkStart w:id="21" w:name="_6e3bf86ca4a4419a12cb229fed6afead0a80bc0"/>
+      <w:r>
+        <w:t xml:space="preserve">Étape 10 — Déploiement local</w:t>
       </w:r>
       <w:bookmarkEnd w:id="21"/>
     </w:p>
@@ -2243,7 +2261,7 @@
         <w:pStyle w:val="FirstParagraph"/>
       </w:pPr>
       <w:r>
-        <w:t xml:space="preserve">Deploys the application locally using Docker Compose and prints the local UI link.</w:t>
+        <w:t xml:space="preserve">Déploie l’application localement avec Docker Compose et affiche le lien de l’interface.</w:t>
       </w:r>
     </w:p>
     <w:p>
@@ -2257,9 +2275,9 @@
       <w:pPr>
         <w:pStyle w:val="Heading2"/>
       </w:pPr>
-      <w:bookmarkStart w:id="22" w:name="_03fb4d85fec63ae9532a73aeda0f6f1613af28c"/>
-      <w:r>
-        <w:t xml:space="preserve">Post Actions</w:t>
+      <w:bookmarkStart w:id="22" w:name="_cb90be60f16ddb22ff3942482c958f9662d4074"/>
+      <w:r>
+        <w:t xml:space="preserve">Actions post-build</w:t>
       </w:r>
       <w:bookmarkEnd w:id="22"/>
     </w:p>
@@ -2517,7 +2535,10 @@
         <w:t xml:space="preserve">success</w:t>
       </w:r>
       <w:r>
-        <w:t xml:space="preserve">: printed when all stages pass.</w:t>
+        <w:t xml:space="preserve"> </w:t>
+      </w:r>
+      <w:r>
+        <w:t xml:space="preserve">: affiché quand toutes les étapes réussissent.</w:t>
       </w:r>
     </w:p>
     <w:p>
@@ -2535,7 +2556,10 @@
         <w:t xml:space="preserve">failure</w:t>
       </w:r>
       <w:r>
-        <w:t xml:space="preserve">: printed when a stage fails.</w:t>
+        <w:t xml:space="preserve"> </w:t>
+      </w:r>
+      <w:r>
+        <w:t xml:space="preserve">: affiché quand une étape échoue.</w:t>
       </w:r>
     </w:p>
     <w:p>
@@ -2553,7 +2577,10 @@
         <w:t xml:space="preserve">cleanup</w:t>
       </w:r>
       <w:r>
-        <w:t xml:space="preserve">: archives coverage/report files and removes temporary files.</w:t>
+        <w:t xml:space="preserve"> </w:t>
+      </w:r>
+      <w:r>
+        <w:t xml:space="preserve">: archive les fichiers de couverture/rapport et supprime les fichiers temporaires.</w:t>
       </w:r>
     </w:p>
     <w:p>
@@ -2567,9 +2594,9 @@
       <w:pPr>
         <w:pStyle w:val="Heading2"/>
       </w:pPr>
-      <w:bookmarkStart w:id="23" w:name="_65674442f764d8396de242464702467d72c8eab"/>
-      <w:r>
-        <w:t xml:space="preserve">Secrets Used</w:t>
+      <w:bookmarkStart w:id="23" w:name="_8f3a91df8d8413c6a821bb59ce181c2e71e2084"/>
+      <w:r>
+        <w:t xml:space="preserve">Secrets utilisés</w:t>
       </w:r>
       <w:bookmarkEnd w:id="23"/>
     </w:p>
@@ -2594,7 +2621,7 @@
               <w:pStyle w:val="Compact"/>
             </w:pPr>
             <w:r>
-              <w:t xml:space="preserve">Jenkins Credential ID</w:t>
+              <w:t xml:space="preserve">Identifiant de credential Jenkins</w:t>
             </w:r>
           </w:p>
         </w:tc>
@@ -2605,7 +2632,7 @@
               <w:pStyle w:val="Compact"/>
             </w:pPr>
             <w:r>
-              <w:t xml:space="preserve">Purpose</w:t>
+              <w:t xml:space="preserve">Usage</w:t>
             </w:r>
           </w:p>
         </w:tc>
@@ -2632,7 +2659,7 @@
               <w:pStyle w:val="Compact"/>
             </w:pPr>
             <w:r>
-              <w:t xml:space="preserve">SonarQube authentication token</w:t>
+              <w:t xml:space="preserve">Jeton d’authentification SonarQube</w:t>
             </w:r>
           </w:p>
         </w:tc>
@@ -2643,7 +2670,7 @@
         <w:pStyle w:val="FirstParagraph"/>
       </w:pPr>
       <w:r>
-        <w:t xml:space="preserve">Secrets are stored only in Jenkins and are never committed to Git.</w:t>
+        <w:t xml:space="preserve">Les secrets sont stockés uniquement dans Jenkins et ne sont jamais commités dans Git.</w:t>
       </w:r>
     </w:p>
     <w:sectPr>

</xml_diff>

<commit_message>
Update pipeline docs for simplified local serve deployment
</commit_message>
<xml_diff>
--- a/docs/pipeline.docx
+++ b/docs/pipeline.docx
@@ -2184,25 +2184,70 @@
         <w:rPr>
           <w:rStyle w:val="StringTok"/>
         </w:rPr>
-        <w:t xml:space="preserve">            echo "Deploying locally with Docker Compose..."</w:t>
-      </w:r>
-      <w:r>
-        <w:br/>
-      </w:r>
-      <w:r>
-        <w:rPr>
-          <w:rStyle w:val="StringTok"/>
-        </w:rPr>
-        <w:t xml:space="preserve">            docker compose down || true</w:t>
-      </w:r>
-      <w:r>
-        <w:br/>
-      </w:r>
-      <w:r>
-        <w:rPr>
-          <w:rStyle w:val="StringTok"/>
-        </w:rPr>
-        <w:t xml:space="preserve">            docker compose up -d --build</w:t>
+        <w:t xml:space="preserve">            export BUILD_ID=dontKillMe</w:t>
+      </w:r>
+      <w:r>
+        <w:br/>
+      </w:r>
+      <w:r>
+        <w:rPr>
+          <w:rStyle w:val="StringTok"/>
+        </w:rPr>
+        <w:t xml:space="preserve">            export JENKINS_NODE_COOKIE=dontKillMe</w:t>
+      </w:r>
+      <w:r>
+        <w:br/>
+      </w:r>
+      <w:r>
+        <w:rPr>
+          <w:rStyle w:val="StringTok"/>
+        </w:rPr>
+        <w:t xml:space="preserve">            echo "Stopping any previous local server..."</w:t>
+      </w:r>
+      <w:r>
+        <w:br/>
+      </w:r>
+      <w:r>
+        <w:rPr>
+          <w:rStyle w:val="StringTok"/>
+        </w:rPr>
+        <w:t xml:space="preserve">            pkill -f "artisan serve" || true</w:t>
+      </w:r>
+      <w:r>
+        <w:br/>
+      </w:r>
+      <w:r>
+        <w:rPr>
+          <w:rStyle w:val="StringTok"/>
+        </w:rPr>
+        <w:t xml:space="preserve">            sleep 1</w:t>
+      </w:r>
+      <w:r>
+        <w:br/>
+      </w:r>
+      <w:r>
+        <w:rPr>
+          <w:rStyle w:val="StringTok"/>
+        </w:rPr>
+        <w:t xml:space="preserve">            echo "Starting local application server..."</w:t>
+      </w:r>
+      <w:r>
+        <w:br/>
+      </w:r>
+      <w:r>
+        <w:rPr>
+          <w:rStyle w:val="StringTok"/>
+        </w:rPr>
+        <w:t xml:space="preserve">            nohup php artisan serve --host=0.0.0.0 --port=8000 &gt; /tmp/nutritrace-serve.log 2&gt;&amp;1 &amp;</w:t>
+      </w:r>
+      <w:r>
+        <w:br/>
+      </w:r>
+      <w:r>
+        <w:rPr>
+          <w:rStyle w:val="StringTok"/>
+        </w:rPr>
+        <w:t xml:space="preserve">            sleep 2</w:t>
       </w:r>
       <w:r>
         <w:br/>
@@ -2261,7 +2306,22 @@
         <w:pStyle w:val="FirstParagraph"/>
       </w:pPr>
       <w:r>
-        <w:t xml:space="preserve">Déploie l’application localement avec Docker Compose et affiche le lien de l’interface.</w:t>
+        <w:t xml:space="preserve">Déploie l’application localement en lançant</w:t>
+      </w:r>
+      <w:r>
+        <w:t xml:space="preserve"> </w:t>
+      </w:r>
+      <w:r>
+        <w:rPr>
+          <w:rStyle w:val="VerbatimChar"/>
+        </w:rPr>
+        <w:t xml:space="preserve">php artisan serve</w:t>
+      </w:r>
+      <w:r>
+        <w:t xml:space="preserve"> </w:t>
+      </w:r>
+      <w:r>
+        <w:t xml:space="preserve">et affiche le lien de l’interface.</w:t>
       </w:r>
     </w:p>
     <w:p>

</xml_diff>

<commit_message>
Sync pipeline docs with latest Jenkinsfile
</commit_message>
<xml_diff>
--- a/docs/pipeline.docx
+++ b/docs/pipeline.docx
@@ -2199,6 +2199,150 @@
         <w:br/>
       </w:r>
       <w:r>
+        <w:br/>
+      </w:r>
+      <w:r>
+        <w:rPr>
+          <w:rStyle w:val="StringTok"/>
+        </w:rPr>
+        <w:t xml:space="preserve">            # Avoid docker-credential-secretservice D-Bus failures in CI.</w:t>
+      </w:r>
+      <w:r>
+        <w:br/>
+      </w:r>
+      <w:r>
+        <w:rPr>
+          <w:rStyle w:val="StringTok"/>
+        </w:rPr>
+        <w:t xml:space="preserve">            mkdir -p .docker-ci/bin</w:t>
+      </w:r>
+      <w:r>
+        <w:br/>
+      </w:r>
+      <w:r>
+        <w:rPr>
+          <w:rStyle w:val="StringTok"/>
+        </w:rPr>
+        <w:t xml:space="preserve">            cat &gt; .docker-ci/bin/docker-credential-secretservice &lt;&lt; 'EOF'</w:t>
+      </w:r>
+      <w:r>
+        <w:br/>
+      </w:r>
+      <w:r>
+        <w:rPr>
+          <w:rStyle w:val="StringTok"/>
+        </w:rPr>
+        <w:t xml:space="preserve">#!/bin/sh</w:t>
+      </w:r>
+      <w:r>
+        <w:br/>
+      </w:r>
+      <w:r>
+        <w:rPr>
+          <w:rStyle w:val="StringTok"/>
+        </w:rPr>
+        <w:t xml:space="preserve">case "$1" in</w:t>
+      </w:r>
+      <w:r>
+        <w:br/>
+      </w:r>
+      <w:r>
+        <w:rPr>
+          <w:rStyle w:val="StringTok"/>
+        </w:rPr>
+        <w:t xml:space="preserve">  get|list|store|erase) echo '{}' ;;</w:t>
+      </w:r>
+      <w:r>
+        <w:br/>
+      </w:r>
+      <w:r>
+        <w:rPr>
+          <w:rStyle w:val="StringTok"/>
+        </w:rPr>
+        <w:t xml:space="preserve">  *) echo '{}' ;;</w:t>
+      </w:r>
+      <w:r>
+        <w:br/>
+      </w:r>
+      <w:r>
+        <w:rPr>
+          <w:rStyle w:val="StringTok"/>
+        </w:rPr>
+        <w:t xml:space="preserve">esac</w:t>
+      </w:r>
+      <w:r>
+        <w:br/>
+      </w:r>
+      <w:r>
+        <w:rPr>
+          <w:rStyle w:val="StringTok"/>
+        </w:rPr>
+        <w:t xml:space="preserve">exit 0</w:t>
+      </w:r>
+      <w:r>
+        <w:br/>
+      </w:r>
+      <w:r>
+        <w:rPr>
+          <w:rStyle w:val="StringTok"/>
+        </w:rPr>
+        <w:t xml:space="preserve">EOF</w:t>
+      </w:r>
+      <w:r>
+        <w:br/>
+      </w:r>
+      <w:r>
+        <w:rPr>
+          <w:rStyle w:val="StringTok"/>
+        </w:rPr>
+        <w:t xml:space="preserve">            chmod +x .docker-ci/bin/docker-credential-secretservice</w:t>
+      </w:r>
+      <w:r>
+        <w:br/>
+      </w:r>
+      <w:r>
+        <w:rPr>
+          <w:rStyle w:val="StringTok"/>
+        </w:rPr>
+        <w:t xml:space="preserve">            export PATH="$PWD/.docker-ci/bin:$PATH"</w:t>
+      </w:r>
+      <w:r>
+        <w:br/>
+      </w:r>
+      <w:r>
+        <w:br/>
+      </w:r>
+      <w:r>
+        <w:rPr>
+          <w:rStyle w:val="StringTok"/>
+        </w:rPr>
+        <w:t xml:space="preserve">            mkdir -p .docker-ci/config</w:t>
+      </w:r>
+      <w:r>
+        <w:br/>
+      </w:r>
+      <w:r>
+        <w:rPr>
+          <w:rStyle w:val="StringTok"/>
+        </w:rPr>
+        <w:t xml:space="preserve">            printf '{"auths":{},"credHelpers":{}}' &gt; .docker-ci/config/config.json</w:t>
+      </w:r>
+      <w:r>
+        <w:br/>
+      </w:r>
+      <w:r>
+        <w:rPr>
+          <w:rStyle w:val="StringTok"/>
+        </w:rPr>
+        <w:t xml:space="preserve">            export DOCKER_CONFIG="$PWD/.docker-ci/config"</w:t>
+      </w:r>
+      <w:r>
+        <w:br/>
+      </w:r>
+      <w:r>
+        <w:br/>
+      </w:r>
+      <w:r>
         <w:rPr>
           <w:rStyle w:val="StringTok"/>
         </w:rPr>
@@ -2226,28 +2370,34 @@
         <w:br/>
       </w:r>
       <w:r>
-        <w:rPr>
-          <w:rStyle w:val="StringTok"/>
-        </w:rPr>
-        <w:t xml:space="preserve">            echo "Starting local application server..."</w:t>
-      </w:r>
-      <w:r>
-        <w:br/>
-      </w:r>
-      <w:r>
-        <w:rPr>
-          <w:rStyle w:val="StringTok"/>
-        </w:rPr>
-        <w:t xml:space="preserve">            nohup php artisan serve --host=0.0.0.0 --port=8000 &gt; /tmp/nutritrace-serve.log 2&gt;&amp;1 &amp;</w:t>
-      </w:r>
-      <w:r>
-        <w:br/>
-      </w:r>
-      <w:r>
-        <w:rPr>
-          <w:rStyle w:val="StringTok"/>
-        </w:rPr>
-        <w:t xml:space="preserve">            sleep 2</w:t>
+        <w:br/>
+      </w:r>
+      <w:r>
+        <w:rPr>
+          <w:rStyle w:val="StringTok"/>
+        </w:rPr>
+        <w:t xml:space="preserve">            echo "Deploying locally with Docker Compose..."</w:t>
+      </w:r>
+      <w:r>
+        <w:br/>
+      </w:r>
+      <w:r>
+        <w:rPr>
+          <w:rStyle w:val="StringTok"/>
+        </w:rPr>
+        <w:t xml:space="preserve">            docker compose down || true</w:t>
+      </w:r>
+      <w:r>
+        <w:br/>
+      </w:r>
+      <w:r>
+        <w:rPr>
+          <w:rStyle w:val="StringTok"/>
+        </w:rPr>
+        <w:t xml:space="preserve">            docker compose up -d --build</w:t>
+      </w:r>
+      <w:r>
+        <w:br/>
       </w:r>
       <w:r>
         <w:br/>
@@ -2274,6 +2424,15 @@
         <w:rPr>
           <w:rStyle w:val="StringTok"/>
         </w:rPr>
+        <w:t xml:space="preserve">            rm -rf .docker-ci</w:t>
+      </w:r>
+      <w:r>
+        <w:br/>
+      </w:r>
+      <w:r>
+        <w:rPr>
+          <w:rStyle w:val="StringTok"/>
+        </w:rPr>
         <w:t xml:space="preserve">        '''</w:t>
       </w:r>
       <w:r>
@@ -2306,22 +2465,7 @@
         <w:pStyle w:val="FirstParagraph"/>
       </w:pPr>
       <w:r>
-        <w:t xml:space="preserve">Déploie l’application localement en lançant</w:t>
-      </w:r>
-      <w:r>
-        <w:t xml:space="preserve"> </w:t>
-      </w:r>
-      <w:r>
-        <w:rPr>
-          <w:rStyle w:val="VerbatimChar"/>
-        </w:rPr>
-        <w:t xml:space="preserve">php artisan serve</w:t>
-      </w:r>
-      <w:r>
-        <w:t xml:space="preserve"> </w:t>
-      </w:r>
-      <w:r>
-        <w:t xml:space="preserve">et affiche le lien de l’interface.</w:t>
+        <w:t xml:space="preserve">Déploie l’application localement avec Docker Compose, en contournant le problème de helper d’identifiants Docker, puis affiche le lien de l’interface.</w:t>
       </w:r>
     </w:p>
     <w:p>

</xml_diff>

<commit_message>
Add BioDev team guard page and team info to docs
</commit_message>
<xml_diff>
--- a/docs/pipeline.docx
+++ b/docs/pipeline.docx
@@ -2877,6 +2877,83 @@
         <w:t xml:space="preserve">Les secrets sont stockés uniquement dans Jenkins et ne sont jamais commités dans Git.</w:t>
       </w:r>
     </w:p>
+    <w:p>
+      <w:r>
+        <w:pict>
+          <v:rect style="width:0;height:1.5pt" o:hralign="center" o:hrstd="t" o:hr="t"/>
+        </w:pict>
+      </w:r>
+    </w:p>
+    <w:p>
+      <w:pPr>
+        <w:pStyle w:val="Heading2"/>
+      </w:pPr>
+      <w:bookmarkStart w:id="24" w:name="_9a95f9cf0b1007c1ab0c5668365fe0ad5d3cb44"/>
+      <w:r>
+        <w:t xml:space="preserve">Équipe BioDev — 5TWIN4</w:t>
+      </w:r>
+      <w:bookmarkEnd w:id="24"/>
+    </w:p>
+    <w:p>
+      <w:pPr>
+        <w:pStyle w:val="Compact"/>
+        <w:numPr>
+          <w:ilvl w:val="0"/>
+          <w:numId w:val="1004"/>
+        </w:numPr>
+      </w:pPr>
+      <w:r>
+        <w:t xml:space="preserve">Mohamed Amine Chniti</w:t>
+      </w:r>
+    </w:p>
+    <w:p>
+      <w:pPr>
+        <w:pStyle w:val="Compact"/>
+        <w:numPr>
+          <w:ilvl w:val="0"/>
+          <w:numId w:val="1004"/>
+        </w:numPr>
+      </w:pPr>
+      <w:r>
+        <w:t xml:space="preserve">Mohamed Amine Souibgui</w:t>
+      </w:r>
+    </w:p>
+    <w:p>
+      <w:pPr>
+        <w:pStyle w:val="Compact"/>
+        <w:numPr>
+          <w:ilvl w:val="0"/>
+          <w:numId w:val="1004"/>
+        </w:numPr>
+      </w:pPr>
+      <w:r>
+        <w:t xml:space="preserve">Wiem Karaja</w:t>
+      </w:r>
+    </w:p>
+    <w:p>
+      <w:pPr>
+        <w:pStyle w:val="Compact"/>
+        <w:numPr>
+          <w:ilvl w:val="0"/>
+          <w:numId w:val="1004"/>
+        </w:numPr>
+      </w:pPr>
+      <w:r>
+        <w:t xml:space="preserve">Hiba Khadhraoui</w:t>
+      </w:r>
+    </w:p>
+    <w:p>
+      <w:pPr>
+        <w:pStyle w:val="Compact"/>
+        <w:numPr>
+          <w:ilvl w:val="0"/>
+          <w:numId w:val="1004"/>
+        </w:numPr>
+      </w:pPr>
+      <w:r>
+        <w:t xml:space="preserve">Montaha Trabelsi</w:t>
+      </w:r>
+    </w:p>
     <w:sectPr>
       <w:footnotePr>
         <w:numRestart w:val="eachSect"/>
@@ -3100,6 +3177,9 @@
     <w:abstractNumId w:val="991"/>
   </w:num>
   <w:num w:numId="1003">
+    <w:abstractNumId w:val="991"/>
+  </w:num>
+  <w:num w:numId="1004">
     <w:abstractNumId w:val="991"/>
   </w:num>
 </w:numbering>

</xml_diff>

<commit_message>
Move BioDev team guard page to document and remove it from app UI
</commit_message>
<xml_diff>
--- a/docs/pipeline.docx
+++ b/docs/pipeline.docx
@@ -6,11 +6,104 @@
       <w:pPr>
         <w:pStyle w:val="Heading1"/>
       </w:pPr>
-      <w:bookmarkStart w:id="9" w:name="_cf1ab96d82f8843a2658fd77a14bede9ba12c2f"/>
+      <w:bookmarkStart w:id="9" w:name="_62ff0e4be8b2a82aca85710683de5ff66dc46d1"/>
+      <w:r>
+        <w:t xml:space="preserve">Page de garde — BioDev (5TWIN4)</w:t>
+      </w:r>
+      <w:bookmarkEnd w:id="9"/>
+    </w:p>
+    <w:p>
+      <w:pPr>
+        <w:pStyle w:val="FirstParagraph"/>
+      </w:pPr>
+      <w:r>
+        <w:rPr>
+          <w:b/>
+          <w:bCs/>
+        </w:rPr>
+        <w:t xml:space="preserve">Groupe :</w:t>
+      </w:r>
+      <w:r>
+        <w:t xml:space="preserve"> </w:t>
+      </w:r>
+      <w:r>
+        <w:t xml:space="preserve">BioDev</w:t>
+      </w:r>
+      <w:r>
+        <w:br/>
+      </w:r>
+      <w:r>
+        <w:rPr>
+          <w:b/>
+          <w:bCs/>
+        </w:rPr>
+        <w:t xml:space="preserve">Classe :</w:t>
+      </w:r>
+      <w:r>
+        <w:t xml:space="preserve"> </w:t>
+      </w:r>
+      <w:r>
+        <w:t xml:space="preserve">5TWIN4</w:t>
+      </w:r>
+    </w:p>
+    <w:p>
+      <w:pPr>
+        <w:pStyle w:val="BodyText"/>
+      </w:pPr>
+      <w:r>
+        <w:rPr>
+          <w:b/>
+          <w:bCs/>
+        </w:rPr>
+        <w:t xml:space="preserve">Membres :</w:t>
+      </w:r>
+      <w:r>
+        <w:t xml:space="preserve"> </w:t>
+      </w:r>
+      <w:r>
+        <w:t xml:space="preserve">- Mohamed Amine Chniti</w:t>
+      </w:r>
+      <w:r>
+        <w:t xml:space="preserve"> </w:t>
+      </w:r>
+      <w:r>
+        <w:t xml:space="preserve">- Mohamed Amine Souibgui</w:t>
+      </w:r>
+      <w:r>
+        <w:t xml:space="preserve"> </w:t>
+      </w:r>
+      <w:r>
+        <w:t xml:space="preserve">- Wiem Karaja</w:t>
+      </w:r>
+      <w:r>
+        <w:t xml:space="preserve"> </w:t>
+      </w:r>
+      <w:r>
+        <w:t xml:space="preserve">- Hiba Khadhraoui</w:t>
+      </w:r>
+      <w:r>
+        <w:t xml:space="preserve"> </w:t>
+      </w:r>
+      <w:r>
+        <w:t xml:space="preserve">- Montaha Trabelsi</w:t>
+      </w:r>
+    </w:p>
+    <w:p>
+      <w:r>
+        <w:pict>
+          <v:rect style="width:0;height:1.5pt" o:hralign="center" o:hrstd="t" o:hr="t"/>
+        </w:pict>
+      </w:r>
+    </w:p>
+    <w:p>
+      <w:pPr>
+        <w:pStyle w:val="Heading1"/>
+      </w:pPr>
+      <w:bookmarkStart w:id="10" w:name="_cf1ab96d82f8843a2658fd77a14bede9ba12c2f"/>
       <w:r>
         <w:t xml:space="preserve">Pipeline Jenkins NutriTrace — Documentation étape par étape</w:t>
       </w:r>
-      <w:bookmarkEnd w:id="9"/>
+      <w:bookmarkEnd w:id="10"/>
     </w:p>
     <w:p>
       <w:pPr>
@@ -42,11 +135,11 @@
       <w:pPr>
         <w:pStyle w:val="Heading2"/>
       </w:pPr>
-      <w:bookmarkStart w:id="10" w:name="_97256f70146aabb1f65f9f1819e25347b5abb29"/>
+      <w:bookmarkStart w:id="11" w:name="_97256f70146aabb1f65f9f1819e25347b5abb29"/>
       <w:r>
         <w:t xml:space="preserve">Options du pipeline</w:t>
       </w:r>
-      <w:bookmarkEnd w:id="10"/>
+      <w:bookmarkEnd w:id="11"/>
     </w:p>
     <w:p>
       <w:pPr>
@@ -246,11 +339,11 @@
       <w:pPr>
         <w:pStyle w:val="Heading2"/>
       </w:pPr>
-      <w:bookmarkStart w:id="11" w:name="_47c9201f1030a65e6e2083c0d456ad32e4dfe1d"/>
+      <w:bookmarkStart w:id="12" w:name="_47c9201f1030a65e6e2083c0d456ad32e4dfe1d"/>
       <w:r>
         <w:t xml:space="preserve">Variables d’environnement</w:t>
       </w:r>
-      <w:bookmarkEnd w:id="11"/>
+      <w:bookmarkEnd w:id="12"/>
     </w:p>
     <w:p>
       <w:pPr>
@@ -487,11 +580,11 @@
       <w:pPr>
         <w:pStyle w:val="Heading2"/>
       </w:pPr>
-      <w:bookmarkStart w:id="12" w:name="_2b7d3b277898fd9e290a132de4cece7f5c65d4c"/>
+      <w:bookmarkStart w:id="13" w:name="_2b7d3b277898fd9e290a132de4cece7f5c65d4c"/>
       <w:r>
         <w:t xml:space="preserve">Étape 1 — Checkout</w:t>
       </w:r>
-      <w:bookmarkEnd w:id="12"/>
+      <w:bookmarkEnd w:id="13"/>
     </w:p>
     <w:p>
       <w:pPr>
@@ -613,11 +706,11 @@
       <w:pPr>
         <w:pStyle w:val="Heading2"/>
       </w:pPr>
-      <w:bookmarkStart w:id="13" w:name="_5d8d23522d23b6f662e41323650dd7b79c3187b"/>
+      <w:bookmarkStart w:id="14" w:name="_5d8d23522d23b6f662e41323650dd7b79c3187b"/>
       <w:r>
         <w:t xml:space="preserve">Étape 2 — Installation des dépendances PHP</w:t>
       </w:r>
-      <w:bookmarkEnd w:id="13"/>
+      <w:bookmarkEnd w:id="14"/>
     </w:p>
     <w:p>
       <w:pPr>
@@ -733,11 +826,11 @@
       <w:pPr>
         <w:pStyle w:val="Heading2"/>
       </w:pPr>
-      <w:bookmarkStart w:id="14" w:name="_ba2e87d7038fdde4a98988f972c36410659c5f3"/>
+      <w:bookmarkStart w:id="15" w:name="_ba2e87d7038fdde4a98988f972c36410659c5f3"/>
       <w:r>
         <w:t xml:space="preserve">Étape 3 — Préparation de l’environnement</w:t>
       </w:r>
-      <w:bookmarkEnd w:id="14"/>
+      <w:bookmarkEnd w:id="15"/>
     </w:p>
     <w:p>
       <w:pPr>
@@ -931,11 +1024,11 @@
       <w:pPr>
         <w:pStyle w:val="Heading2"/>
       </w:pPr>
-      <w:bookmarkStart w:id="15" w:name="_d65427d7edaee028971c0cb53389c7b51311367"/>
+      <w:bookmarkStart w:id="16" w:name="_d65427d7edaee028971c0cb53389c7b51311367"/>
       <w:r>
         <w:t xml:space="preserve">Étape 4 — Lint (Pint)</w:t>
       </w:r>
-      <w:bookmarkEnd w:id="15"/>
+      <w:bookmarkEnd w:id="16"/>
     </w:p>
     <w:p>
       <w:pPr>
@@ -1051,11 +1144,11 @@
       <w:pPr>
         <w:pStyle w:val="Heading2"/>
       </w:pPr>
-      <w:bookmarkStart w:id="16" w:name="_d315c319d933bf2d95b1fdec475269ca5d92b45"/>
+      <w:bookmarkStart w:id="17" w:name="_d315c319d933bf2d95b1fdec475269ca5d92b45"/>
       <w:r>
         <w:t xml:space="preserve">Étape 5 — Vérification syntaxique</w:t>
       </w:r>
-      <w:bookmarkEnd w:id="16"/>
+      <w:bookmarkEnd w:id="17"/>
     </w:p>
     <w:p>
       <w:pPr>
@@ -1186,11 +1279,11 @@
       <w:pPr>
         <w:pStyle w:val="Heading2"/>
       </w:pPr>
-      <w:bookmarkStart w:id="17" w:name="_0efae85683ffb25de23c65491421ad524aaf153"/>
+      <w:bookmarkStart w:id="18" w:name="_0efae85683ffb25de23c65491421ad524aaf153"/>
       <w:r>
         <w:t xml:space="preserve">Étape 6 — Build du frontend</w:t>
       </w:r>
-      <w:bookmarkEnd w:id="17"/>
+      <w:bookmarkEnd w:id="18"/>
     </w:p>
     <w:p>
       <w:pPr>
@@ -1423,11 +1516,11 @@
       <w:pPr>
         <w:pStyle w:val="Heading2"/>
       </w:pPr>
-      <w:bookmarkStart w:id="18" w:name="_a0a4ab28a3da1fba096ec176176e6bfd2e9d9c8"/>
+      <w:bookmarkStart w:id="19" w:name="_a0a4ab28a3da1fba096ec176176e6bfd2e9d9c8"/>
       <w:r>
         <w:t xml:space="preserve">Étape 7 — Migration et seed</w:t>
       </w:r>
-      <w:bookmarkEnd w:id="18"/>
+      <w:bookmarkEnd w:id="19"/>
     </w:p>
     <w:p>
       <w:pPr>
@@ -1579,11 +1672,11 @@
       <w:pPr>
         <w:pStyle w:val="Heading2"/>
       </w:pPr>
-      <w:bookmarkStart w:id="19" w:name="_45ab1b4b00e7b94264c331a693e7318fd40b04b"/>
+      <w:bookmarkStart w:id="20" w:name="_45ab1b4b00e7b94264c331a693e7318fd40b04b"/>
       <w:r>
         <w:t xml:space="preserve">Étape 8 — Tests et couverture</w:t>
       </w:r>
-      <w:bookmarkEnd w:id="19"/>
+      <w:bookmarkEnd w:id="20"/>
     </w:p>
     <w:p>
       <w:pPr>
@@ -1711,11 +1804,11 @@
       <w:pPr>
         <w:pStyle w:val="Heading2"/>
       </w:pPr>
-      <w:bookmarkStart w:id="20" w:name="_e45338fe5dea94cb903d24298840de412fa3bc5"/>
+      <w:bookmarkStart w:id="21" w:name="_e45338fe5dea94cb903d24298840de412fa3bc5"/>
       <w:r>
         <w:t xml:space="preserve">Étape 9 — Analyse SonarQube</w:t>
       </w:r>
-      <w:bookmarkEnd w:id="20"/>
+      <w:bookmarkEnd w:id="21"/>
     </w:p>
     <w:p>
       <w:pPr>
@@ -2092,11 +2185,11 @@
       <w:pPr>
         <w:pStyle w:val="Heading2"/>
       </w:pPr>
-      <w:bookmarkStart w:id="21" w:name="_6e3bf86ca4a4419a12cb229fed6afead0a80bc0"/>
+      <w:bookmarkStart w:id="22" w:name="_6e3bf86ca4a4419a12cb229fed6afead0a80bc0"/>
       <w:r>
         <w:t xml:space="preserve">Étape 10 — Déploiement local</w:t>
       </w:r>
-      <w:bookmarkEnd w:id="21"/>
+      <w:bookmarkEnd w:id="22"/>
     </w:p>
     <w:p>
       <w:pPr>
@@ -2479,11 +2572,11 @@
       <w:pPr>
         <w:pStyle w:val="Heading2"/>
       </w:pPr>
-      <w:bookmarkStart w:id="22" w:name="_cb90be60f16ddb22ff3942482c958f9662d4074"/>
+      <w:bookmarkStart w:id="23" w:name="_cb90be60f16ddb22ff3942482c958f9662d4074"/>
       <w:r>
         <w:t xml:space="preserve">Actions post-build</w:t>
       </w:r>
-      <w:bookmarkEnd w:id="22"/>
+      <w:bookmarkEnd w:id="23"/>
     </w:p>
     <w:p>
       <w:pPr>
@@ -2798,11 +2891,11 @@
       <w:pPr>
         <w:pStyle w:val="Heading2"/>
       </w:pPr>
-      <w:bookmarkStart w:id="23" w:name="_8f3a91df8d8413c6a821bb59ce181c2e71e2084"/>
+      <w:bookmarkStart w:id="24" w:name="_8f3a91df8d8413c6a821bb59ce181c2e71e2084"/>
       <w:r>
         <w:t xml:space="preserve">Secrets utilisés</w:t>
       </w:r>
-      <w:bookmarkEnd w:id="23"/>
+      <w:bookmarkEnd w:id="24"/>
     </w:p>
     <w:tbl>
       <w:tblPr>
@@ -2877,83 +2970,6 @@
         <w:t xml:space="preserve">Les secrets sont stockés uniquement dans Jenkins et ne sont jamais commités dans Git.</w:t>
       </w:r>
     </w:p>
-    <w:p>
-      <w:r>
-        <w:pict>
-          <v:rect style="width:0;height:1.5pt" o:hralign="center" o:hrstd="t" o:hr="t"/>
-        </w:pict>
-      </w:r>
-    </w:p>
-    <w:p>
-      <w:pPr>
-        <w:pStyle w:val="Heading2"/>
-      </w:pPr>
-      <w:bookmarkStart w:id="24" w:name="_9a95f9cf0b1007c1ab0c5668365fe0ad5d3cb44"/>
-      <w:r>
-        <w:t xml:space="preserve">Équipe BioDev — 5TWIN4</w:t>
-      </w:r>
-      <w:bookmarkEnd w:id="24"/>
-    </w:p>
-    <w:p>
-      <w:pPr>
-        <w:pStyle w:val="Compact"/>
-        <w:numPr>
-          <w:ilvl w:val="0"/>
-          <w:numId w:val="1004"/>
-        </w:numPr>
-      </w:pPr>
-      <w:r>
-        <w:t xml:space="preserve">Mohamed Amine Chniti</w:t>
-      </w:r>
-    </w:p>
-    <w:p>
-      <w:pPr>
-        <w:pStyle w:val="Compact"/>
-        <w:numPr>
-          <w:ilvl w:val="0"/>
-          <w:numId w:val="1004"/>
-        </w:numPr>
-      </w:pPr>
-      <w:r>
-        <w:t xml:space="preserve">Mohamed Amine Souibgui</w:t>
-      </w:r>
-    </w:p>
-    <w:p>
-      <w:pPr>
-        <w:pStyle w:val="Compact"/>
-        <w:numPr>
-          <w:ilvl w:val="0"/>
-          <w:numId w:val="1004"/>
-        </w:numPr>
-      </w:pPr>
-      <w:r>
-        <w:t xml:space="preserve">Wiem Karaja</w:t>
-      </w:r>
-    </w:p>
-    <w:p>
-      <w:pPr>
-        <w:pStyle w:val="Compact"/>
-        <w:numPr>
-          <w:ilvl w:val="0"/>
-          <w:numId w:val="1004"/>
-        </w:numPr>
-      </w:pPr>
-      <w:r>
-        <w:t xml:space="preserve">Hiba Khadhraoui</w:t>
-      </w:r>
-    </w:p>
-    <w:p>
-      <w:pPr>
-        <w:pStyle w:val="Compact"/>
-        <w:numPr>
-          <w:ilvl w:val="0"/>
-          <w:numId w:val="1004"/>
-        </w:numPr>
-      </w:pPr>
-      <w:r>
-        <w:t xml:space="preserve">Montaha Trabelsi</w:t>
-      </w:r>
-    </w:p>
     <w:sectPr>
       <w:footnotePr>
         <w:numRestart w:val="eachSect"/>
@@ -3177,9 +3193,6 @@
     <w:abstractNumId w:val="991"/>
   </w:num>
   <w:num w:numId="1003">
-    <w:abstractNumId w:val="991"/>
-  </w:num>
-  <w:num w:numId="1004">
     <w:abstractNumId w:val="991"/>
   </w:num>
 </w:numbering>

</xml_diff>